<commit_message>
Cambios en el guion
</commit_message>
<xml_diff>
--- a/guion/GuiónVideoExplicativo.docx
+++ b/guion/GuiónVideoExplicativo.docx
@@ -628,10 +628,23 @@
         <w:t>ELI: Somos JEN</w:t>
       </w:r>
       <w:r>
-        <w:t xml:space="preserve"> productions</w:t>
-      </w:r>
-      <w:r>
-        <w:t>, Jose Antonio, Elisabeth y Néstor, y en este video explicativo vamos a contar nuestra experiencia y nuestro trabajo de manera verbal y visual</w:t>
+        <w:t xml:space="preserve"> </w:t>
+      </w:r>
+      <w:proofErr w:type="spellStart"/>
+      <w:r>
+        <w:t>productions</w:t>
+      </w:r>
+      <w:proofErr w:type="spellEnd"/>
+      <w:r>
+        <w:t xml:space="preserve">, </w:t>
+      </w:r>
+      <w:proofErr w:type="spellStart"/>
+      <w:r>
+        <w:t>Jose</w:t>
+      </w:r>
+      <w:proofErr w:type="spellEnd"/>
+      <w:r>
+        <w:t xml:space="preserve"> Antonio, Elisabeth y Néstor, y en este video explicativo vamos a contar nuestra experiencia y nuestro trabajo de manera verbal y visual</w:t>
       </w:r>
       <w:r>
         <w:t xml:space="preserve"> para hacerlo más entretenido.</w:t>
@@ -775,117 +788,61 @@
       </w:r>
     </w:p>
     <w:p>
-      <w:pPr>
-        <w:jc w:val="both"/>
-      </w:pPr>
-      <w:r>
-        <w:t>JOSE</w:t>
-      </w:r>
-      <w:r>
-        <w:t xml:space="preserve">: en primer </w:t>
-      </w:r>
-      <w:r>
-        <w:t>lugar,</w:t>
-      </w:r>
-      <w:r>
-        <w:t xml:space="preserve"> dentro de la página tenemos el primer apartado llamado “El proyecto”, </w:t>
-      </w:r>
-      <w:r>
-        <w:t>que funciona como una breve introducción al proyecto y a la página en general, además incluimos una ficha del proyecto con datos relevantes sobre el equipo, el cliente, formato, etcétera. En la parte final de este apartado tenemos unos indicadores con movimiento que hacen que la página sea más dinámica y por último el contexto histórico de manera más amplia con un recurso audiovisual complementario al cortometraje producido.</w:t>
-      </w:r>
-    </w:p>
-    <w:p>
-      <w:pPr>
-        <w:jc w:val="both"/>
-      </w:pPr>
-      <w:r>
-        <w:t>Nuestro segundo apartado es la “Propuesta técnica” en la que damos un enfoque general del proyecto explicando pues los distintos puntos que son los siguientes:</w:t>
-      </w:r>
-    </w:p>
-    <w:p>
-      <w:pPr>
-        <w:jc w:val="both"/>
-      </w:pPr>
-      <w:r>
-        <w:t xml:space="preserve">Contenido audiovisual, rigor histórico, integración en el museo, los entregables finales y finalmente los objetivos del museo y las soluciones propuestas </w:t>
-      </w:r>
-      <w:r>
-        <w:t>a estos objetivos.</w:t>
-      </w:r>
-    </w:p>
-    <w:p>
-      <w:pPr>
-        <w:jc w:val="both"/>
-      </w:pPr>
-      <w:r>
-        <w:t>En tercer lugar, tenemos “las herramientas empleadas” y ahí tratamos todo el arsenal tecnológico el cual hemos dividido en puntos para poder mostrarlo de forma más clara y ordenada, explicando para qué parte del proyecto de uso, por ejemplo: imagen, video, etcétera, la IA empleada y qué hicimos con ella.</w:t>
-      </w:r>
-    </w:p>
-    <w:p>
-      <w:pPr>
-        <w:jc w:val="both"/>
-      </w:pPr>
-      <w:r>
-        <w:t xml:space="preserve">Un ejemplo es en la parte de vídeo que hemos usado </w:t>
-      </w:r>
+      <w:r>
+        <w:t>JOSE: En primer lugar, dentro de la página tenemos el apartado llamado “El proyecto”, que funciona como una breve introducción tanto al proyecto como a la página en general. Además, incluimos una ficha del proyecto con datos relevantes sobre el equipo, el cliente, el formato, etcétera. En la parte final de este apartado contamos con unos indicadores animados que aportan dinamismo a la página y, por último, se presenta el contexto histórico de forma más amplia junto con un recurso audiovisual complementario al cortometraje producido.</w:t>
+      </w:r>
+    </w:p>
+    <w:p/>
+    <w:p>
+      <w:r>
+        <w:t>Nuestro segundo apartado es la “Propuesta técnica”, en la que ofrecemos una visión general del proyecto explicando los distintos puntos, que son los siguientes: contenido audiovisual, rigor histórico, integración en el museo, entregables finales y, finalmente, los objetivos del museo junto con las soluciones propuestas para alcanzarlos.</w:t>
+      </w:r>
+    </w:p>
+    <w:p/>
+    <w:p>
+      <w:r>
+        <w:t>En tercer lugar, tenemos “Las herramientas empleadas”, donde tratamos todo el arsenal tecnológico utilizado. Lo hemos dividido en diferentes puntos para mostrarlo de forma más clara y ordenada, explicando en qué parte del proyecto se usó cada herramienta; por ejemplo: imagen, vídeo, etcétera, la IA empleada y qué hicimos con ella.</w:t>
+      </w:r>
+    </w:p>
+    <w:p/>
+    <w:p>
+      <w:r>
+        <w:t xml:space="preserve">Un ejemplo es la parte de vídeo, en la que hemos utilizado </w:t>
+      </w:r>
+      <w:proofErr w:type="spellStart"/>
       <w:r>
         <w:t>SuperGrok</w:t>
       </w:r>
-      <w:r>
-        <w:t xml:space="preserve"> para realizar la  a</w:t>
-      </w:r>
-      <w:r>
-        <w:t>nimación de escenas y generación de secuencias de vídeo a partir de imágenes estáticas para dar movimiento al cortometraje.</w:t>
-      </w:r>
-    </w:p>
-    <w:p>
-      <w:pPr>
-        <w:jc w:val="both"/>
-      </w:pPr>
-      <w:r>
-        <w:t>Nuestro cuarto punto es la “Propuesta económica” que como bien dice el nombre del apartado es el presupuesto de producción, en el que recogemos el concepto, detalles de este y el coste, finalmente añadimos el 21 porciento de IVA para poder dar el precio con IVA y sin IVA, también tenemos dentro de este mismo apartado la documentación del proyecto con enlaces a ciertos sitios como el Informe de investigación, y por último para este apartado tenemos el contrato de producción audiovisual en el que explicamos los términos pactados entre el productor y el comitente.</w:t>
-      </w:r>
-    </w:p>
-    <w:p>
-      <w:pPr>
-        <w:jc w:val="both"/>
-      </w:pPr>
-      <w:r>
-        <w:t>El quinto punto es la galería que dividimos en tres partes: escenarios, personajes y objetos. Estas imágenes se pueden aumentar pulsando en ellas y abriéndose así un carrusel, además, al pasar el ratón por encima aparece el nombre de la foto. Respecto a los personajes, aparecen divididos y con una breve descripción real en algunos personajes que sí aparecen 100 por 100 en la batalla y ficticia en el caso de por ejemplo del protagonista, ya que no se puede corroborar que haya existido ese personaje.</w:t>
-      </w:r>
-    </w:p>
-    <w:p>
-      <w:pPr>
-        <w:jc w:val="both"/>
-      </w:pPr>
-      <w:r>
-        <w:t xml:space="preserve">El penúltimo apartado es información sobre el “Equipo profesional”, con una foto de cada integrante generada con IA y la parte a la que se dedicaron mayormente, </w:t>
-      </w:r>
+      <w:proofErr w:type="spellEnd"/>
+      <w:r>
+        <w:t xml:space="preserve"> para realizar la animación de escenas y la generación de secuencias de vídeo a partir de imágenes estáticas, con el objetivo de dar movimiento al cortometraje.</w:t>
+      </w:r>
+    </w:p>
+    <w:p/>
+    <w:p>
+      <w:r>
+        <w:t>Nuestro cuarto punto es la “Propuesta económica”, que, como bien indica el nombre del apartado, recoge el presupuesto de producción. En él incluimos el concepto, los detalles correspondientes y el coste. Finalmente, añadimos el 21 % de IVA para ofrecer el precio con IVA y sin IVA. También tenemos dentro de este mismo apartado la documentación del proyecto, con enlaces a ciertos sitios como el Informe de Investigación. Por último, incluimos el contrato de producción audiovisual, en el que explicamos los términos pactados entre el productor y el comitente.</w:t>
+      </w:r>
+    </w:p>
+    <w:p/>
+    <w:p>
       <w:r>
         <w:lastRenderedPageBreak/>
-        <w:t xml:space="preserve">cabe destacar que todos hicimos todo pero </w:t>
-      </w:r>
-      <w:r>
-        <w:t>cada uno se dedicó en mayor profundidad a ciertas acciones.</w:t>
-      </w:r>
-    </w:p>
-    <w:p>
-      <w:pPr>
-        <w:jc w:val="both"/>
-      </w:pPr>
-      <w:r>
-        <w:t>Finalmente tenemos dos códigos QR para acceder al cortometraje y a la defensa y explicación.</w:t>
-      </w:r>
-      <w:r>
-        <w:t xml:space="preserve"> </w:t>
-      </w:r>
-    </w:p>
-    <w:p>
-      <w:pPr>
-        <w:jc w:val="both"/>
-      </w:pPr>
-    </w:p>
-    <w:p/>
+        <w:t>El quinto punto es la galería, que dividimos en tres partes: escenarios, personajes y objetos. Estas imágenes se pueden ampliar pulsando sobre ellas, abriéndose así un carrusel. Además, al pasar el ratón por encima aparece el nombre de la imagen. Respecto a los personajes, aparecen divididos y acompañados de una breve descripción: real en aquellos personajes que sí participaron al 100 % en la batalla, y ficticia en casos como, por ejemplo, el protagonista, ya que no se puede corroborar la existencia de dicho personaje.</w:t>
+      </w:r>
+    </w:p>
+    <w:p/>
+    <w:p>
+      <w:r>
+        <w:t>El penúltimo apartado es la información sobre el “Equipo profesional”, con una foto de cada integrante generada con IA y la parte a la que se dedicaron principalmente. Cabe destacar que todos participamos en todas las tareas, aunque cada uno profundizó más en determinadas acciones.</w:t>
+      </w:r>
+    </w:p>
+    <w:p/>
+    <w:p>
+      <w:r>
+        <w:t>Finalmente, contamos con dos códigos QR para acceder al cortometraje y a la defensa y explicación del proyecto.</w:t>
+      </w:r>
+    </w:p>
     <w:p>
       <w:pPr>
         <w:pStyle w:val="Ttulo1"/>
@@ -916,7 +873,15 @@
     </w:p>
     <w:p>
       <w:r>
-        <w:t>El uso de prompts para recrear la batalla nos ayudó a comprender mejor el contenido histórico, aunque siempre fue necesaria la revisión humana para garantizar coherencia y fidelidad.</w:t>
+        <w:t xml:space="preserve">El uso de </w:t>
+      </w:r>
+      <w:proofErr w:type="spellStart"/>
+      <w:r>
+        <w:t>prompts</w:t>
+      </w:r>
+      <w:proofErr w:type="spellEnd"/>
+      <w:r>
+        <w:t xml:space="preserve"> para recrear la batalla nos ayudó a comprender mejor el contenido histórico, aunque siempre fue necesaria la revisión humana para garantizar coherencia y fidelidad.</w:t>
       </w:r>
     </w:p>
     <w:p>
@@ -944,6 +909,7 @@
     </w:p>
     <w:p>
       <w:r>
+        <w:lastRenderedPageBreak/>
         <w:t>En el cortometraje sobre la Batalla de las Navas de Tolosa, la IA permitió generar representaciones visuales de hechos históricos, aportando valor al proyecto, aunque siempre fue necesario ajustarlas para mantener la coherencia histórica y narrativa.</w:t>
       </w:r>
     </w:p>
@@ -967,16 +933,123 @@
         <w:t xml:space="preserve"> </w:t>
       </w:r>
       <w:r>
-        <w:t xml:space="preserve">Mi experiencia con la IA generativa durante este proyecto ha sido muy positiva tanto a nivel técnico como organizativo. Al principio la usamos para </w:t>
-      </w:r>
+        <w:t>Mi experiencia con la IA generativa durante este proyecto ha sido muy positiva tanto a nivel técnico como organizativo. Al principio la usamos para buscar y sintetizar información sobre la Batalla de las Navas de Tolosa, lo que nos ayudó a trabajar de forma más rápida y precisa.</w:t>
+      </w:r>
+    </w:p>
+    <w:p>
+      <w:r>
+        <w:t>Después, la IA se convirtió en una herramienta fundamental para crear contenidos. En la web nos ayudó a redactar y estructurar los textos con coherencia, y en el cortometraje nos permitió generar recursos visuales para recrear escenas históricas complejas.</w:t>
+      </w:r>
+    </w:p>
+    <w:p/>
+    <w:p>
+      <w:pPr>
+        <w:pStyle w:val="Ttulo1"/>
+      </w:pPr>
+      <w:r>
+        <w:t>EXPLICACIÓN DE LA CREACIÓN DE UNA ESCENA</w:t>
+      </w:r>
+    </w:p>
+    <w:p>
+      <w:pPr>
+        <w:jc w:val="both"/>
+      </w:pPr>
+      <w:r>
+        <w:t>ELI: (ESCENA 8) para la creación de esta escen</w:t>
+      </w:r>
+      <w:r>
+        <w:t xml:space="preserve">a definimos un </w:t>
+      </w:r>
+      <w:proofErr w:type="spellStart"/>
+      <w:r>
+        <w:t>prompt</w:t>
+      </w:r>
+      <w:proofErr w:type="spellEnd"/>
+      <w:r>
+        <w:t xml:space="preserve"> completo de todos los detalles necesarios. Este sería el </w:t>
+      </w:r>
+      <w:proofErr w:type="spellStart"/>
+      <w:r>
+        <w:t>prompt</w:t>
+      </w:r>
+      <w:proofErr w:type="spellEnd"/>
+      <w:r>
+        <w:t xml:space="preserve">(Enseña el </w:t>
+      </w:r>
+      <w:proofErr w:type="spellStart"/>
+      <w:r>
+        <w:t>prompt</w:t>
+      </w:r>
+      <w:proofErr w:type="spellEnd"/>
+      <w:r>
+        <w:t xml:space="preserve">) como es muy largo voy a entrar a explicarlo de manera breve. En primer </w:t>
+      </w:r>
+      <w:r>
+        <w:t>lugar,</w:t>
+      </w:r>
+      <w:r>
+        <w:t xml:space="preserve"> definimos el escenario, quisimos un plano cinematográfico en movimiento, en este caso avanzando hacia delante siendo 3 personas caminando juntas en el atardecer</w:t>
+      </w:r>
+      <w:r>
+        <w:t xml:space="preserve"> que se dirigen hacia una hoguera para sentarse alrededor del fuego</w:t>
+      </w:r>
+      <w:r>
+        <w:t>.</w:t>
+      </w:r>
+    </w:p>
+    <w:p>
+      <w:pPr>
+        <w:jc w:val="both"/>
+      </w:pPr>
+      <w:r>
+        <w:t>Luego definimos los personajes dando una referencia de imágenes como referencia y explicándole a la IA el orden de las imágenes, es decir, imagen 1 y 2 protagonista, imagen 7 escenario, así con todas las que hayamos adjuntado.</w:t>
+      </w:r>
+    </w:p>
+    <w:p>
+      <w:pPr>
+        <w:jc w:val="both"/>
+      </w:pPr>
+      <w:r>
+        <w:t>El siguiente paso fue hacer una distribución fija de los personajes para que la IA nos pusiera a cada personaje en el lugar requerido.</w:t>
+      </w:r>
+    </w:p>
+    <w:p>
+      <w:pPr>
+        <w:jc w:val="both"/>
+      </w:pPr>
+      <w:r>
+        <w:t>Luego añadimos regla de apariencia estricta para cada uno de los personajes, prohibiciones como la de no mezclar identidades, no intercambiar caras, etc.</w:t>
+      </w:r>
+    </w:p>
+    <w:p>
+      <w:pPr>
+        <w:jc w:val="both"/>
+      </w:pPr>
+      <w:r>
+        <w:t>Y por último añadimos indicaciones para el sonido, la iluminación y estilo visual</w:t>
+      </w:r>
+    </w:p>
+    <w:p>
+      <w:pPr>
+        <w:pStyle w:val="Ttulo1"/>
+      </w:pPr>
       <w:r>
         <w:lastRenderedPageBreak/>
-        <w:t>buscar y sintetizar información sobre la Batalla de las Navas de Tolosa, lo que nos ayudó a trabajar de forma más rápida y precisa.</w:t>
-      </w:r>
-    </w:p>
-    <w:p>
-      <w:r>
-        <w:t>Después, la IA se convirtió en una herramienta fundamental para crear contenidos. En la web nos ayudó a redactar y estructurar los textos con coherencia, y en el cortometraje nos permitió generar recursos visuales para recrear escenas históricas complejas.</w:t>
+        <w:t>PROBLEMAS ENCONTRADOS Y SU RESOLUCIÓN</w:t>
+      </w:r>
+    </w:p>
+    <w:p>
+      <w:r>
+        <w:t xml:space="preserve">NÉSTOR: Durante la creación del video hemos encontrado </w:t>
+      </w:r>
+      <w:r>
+        <w:t>bastantes problemas</w:t>
+      </w:r>
+      <w:r>
+        <w:t>, por ejemplo</w:t>
+      </w:r>
+      <w:r>
+        <w:t xml:space="preserve"> </w:t>
       </w:r>
     </w:p>
     <w:p/>
@@ -985,7 +1058,7 @@
         <w:pStyle w:val="Ttulo1"/>
       </w:pPr>
       <w:r>
-        <w:t>EXPLICACIÓN DE LA CREACIÓN DE UNA ESCENA</w:t>
+        <w:t>CONTEXTO DEL VIDEO</w:t>
       </w:r>
     </w:p>
     <w:p>
@@ -993,97 +1066,7 @@
         <w:jc w:val="both"/>
       </w:pPr>
       <w:r>
-        <w:t>ELI: (ESCENA 8) para la creación de esta escen</w:t>
-      </w:r>
-      <w:r>
-        <w:t xml:space="preserve">a definimos un prompt completo de todos los detalles necesarios. Este sería el prompt(Enseña el prompt) como es muy largo voy a entrar a explicarlo de manera breve. En primer </w:t>
-      </w:r>
-      <w:r>
-        <w:t>lugar,</w:t>
-      </w:r>
-      <w:r>
-        <w:t xml:space="preserve"> definimos el escenario, quisimos un plano cinematográfico en movimiento, en este caso avanzando hacia delante siendo 3 personas caminando juntas en el atardecer</w:t>
-      </w:r>
-      <w:r>
-        <w:t xml:space="preserve"> que se dirigen hacia una hoguera para sentarse alrededor del fuego</w:t>
-      </w:r>
-      <w:r>
-        <w:t>.</w:t>
-      </w:r>
-    </w:p>
-    <w:p>
-      <w:pPr>
-        <w:jc w:val="both"/>
-      </w:pPr>
-      <w:r>
-        <w:t>Luego definimos los personajes dando una referencia de imágenes como referencia y explicándole a la IA el orden de las imágenes, es decir, imagen 1 y 2 protagonista, imagen 7 escenario, así con todas las que hayamos adjuntado.</w:t>
-      </w:r>
-    </w:p>
-    <w:p>
-      <w:pPr>
-        <w:jc w:val="both"/>
-      </w:pPr>
-      <w:r>
-        <w:t>El siguiente paso fue hacer una distribución fija de los personajes para que la IA nos pusiera a cada personaje en el lugar requerido.</w:t>
-      </w:r>
-    </w:p>
-    <w:p>
-      <w:pPr>
-        <w:jc w:val="both"/>
-      </w:pPr>
-      <w:r>
-        <w:t>Luego añadimos regla de apariencia estricta para cada uno de los personajes, prohibiciones como la de no mezclar identidades, no intercambiar caras, etc.</w:t>
-      </w:r>
-    </w:p>
-    <w:p>
-      <w:pPr>
-        <w:jc w:val="both"/>
-      </w:pPr>
-      <w:r>
-        <w:t>Y por último añadimos indicaciones para el sonido, la iluminación y estilo visual</w:t>
-      </w:r>
-    </w:p>
-    <w:p>
-      <w:pPr>
-        <w:pStyle w:val="Ttulo1"/>
-      </w:pPr>
-      <w:r>
-        <w:t>PROBLEMAS ENCONTRADOS Y SU RESOLUCIÓN</w:t>
-      </w:r>
-    </w:p>
-    <w:p>
-      <w:r>
-        <w:t xml:space="preserve">NÉSTOR: Durante la creación del video hemos encontrado </w:t>
-      </w:r>
-      <w:r>
-        <w:t>bastantes problemas</w:t>
-      </w:r>
-      <w:r>
-        <w:t>, por ejemplo</w:t>
-      </w:r>
-      <w:r>
-        <w:t xml:space="preserve"> </w:t>
-      </w:r>
-    </w:p>
-    <w:p/>
-    <w:p>
-      <w:pPr>
-        <w:pStyle w:val="Ttulo1"/>
-      </w:pPr>
-      <w:r>
-        <w:t>CONTEXTO DEL VIDEO</w:t>
-      </w:r>
-    </w:p>
-    <w:p>
-      <w:pPr>
-        <w:jc w:val="both"/>
-      </w:pPr>
-      <w:r>
-        <w:t xml:space="preserve">JOSE: En el corto se nos muestra como fueron las 24 horas previas a la batalla con el fin de poder conectar más con los soldados de estas guerras, ver todo lo que dejan atrás y el dolor de sus familias. También nos hemos centrado en mostrar los pensamientos de duda y preocupación de estos. Por eso para nosotros este video muestra la cruda realidad de aquellos hombres que estaban dispuestos a jugarse </w:t>
-      </w:r>
-      <w:r>
-        <w:lastRenderedPageBreak/>
-        <w:t>la vida en el campo de batalla, como luchaban con el fin de regresar sano y salvo con sus familias y como poder llegar a tener una vida mejor para ellos, sus familias y amigos.</w:t>
+        <w:t>JOSE: En el corto se nos muestra como fueron las 24 horas previas a la batalla con el fin de poder conectar más con los soldados de estas guerras, ver todo lo que dejan atrás y el dolor de sus familias. También nos hemos centrado en mostrar los pensamientos de duda y preocupación de estos. Por eso para nosotros este video muestra la cruda realidad de aquellos hombres que estaban dispuestos a jugarse la vida en el campo de batalla, como luchaban con el fin de regresar sano y salvo con sus familias y como poder llegar a tener una vida mejor para ellos, sus familias y amigos.</w:t>
       </w:r>
     </w:p>
     <w:p>
@@ -1100,7 +1083,15 @@
         <w:jc w:val="both"/>
       </w:pPr>
       <w:r>
-        <w:t>ELI: Para hacer a los personajes más cercanos quisimos darles cierta personalidad, por ejemplo Fernando que es el hijo de Rodrigo, el protagonista, representa la familia y el hogar que quedaban atrás, haciéndole ver como un niño pequeño que adora a su padre y de mayor quiere ser como él, en cambio Pascasia la esposa representa el hogar, la vida y la suerte que el protagonista había construido, reflejando la preocupación que ella tiene por no volver a ver a su esposo</w:t>
+        <w:t xml:space="preserve">ELI: Para hacer a los personajes más cercanos quisimos darles cierta personalidad, por ejemplo Fernando que es el hijo de Rodrigo, el protagonista, representa la familia y el hogar que quedaban atrás, haciéndole ver como un niño pequeño que adora a su padre y de mayor quiere ser como él, en cambio </w:t>
+      </w:r>
+      <w:proofErr w:type="spellStart"/>
+      <w:r>
+        <w:t>Pascasia</w:t>
+      </w:r>
+      <w:proofErr w:type="spellEnd"/>
+      <w:r>
+        <w:t xml:space="preserve"> la esposa representa el hogar, la vida y la suerte que el protagonista había construido, reflejando la preocupación que ella tiene por no volver a ver a su esposo</w:t>
       </w:r>
       <w:r>
         <w:t xml:space="preserve"> y el protagonista Rodrigo, representa el valor, el coraje y la esperanza de volver a ver a su familia.</w:t>
@@ -2356,11 +2347,13 @@
     <w:rsid w:val="00586739"/>
     <w:rsid w:val="005F3382"/>
     <w:rsid w:val="006A3EB6"/>
+    <w:rsid w:val="007D4248"/>
     <w:rsid w:val="007E20E0"/>
     <w:rsid w:val="00910E15"/>
     <w:rsid w:val="00A15811"/>
     <w:rsid w:val="00AF7B50"/>
     <w:rsid w:val="00B1352C"/>
+    <w:rsid w:val="00B277AB"/>
   </w:rsids>
   <m:mathPr>
     <m:mathFont m:val="Cambria Math"/>

</xml_diff>